<commit_message>
Add React guest SPA with mock patterns and lab 5 docs.
Co-authored-by: Cursor <cursoragent@cursor.com>
</commit_message>
<xml_diff>
--- a/docs/РПЗ_Шебеко.docx
+++ b/docs/РПЗ_Шебеко.docx
@@ -1376,6 +1376,9 @@
       <w:pPr>
         <w:spacing w:after="240" w:line="360" w:lineRule="auto"/>
         <w:jc w:val="center"/>
+        <w:rPr>
+          <w:lang w:val="en-US"/>
+        </w:rPr>
       </w:pPr>
       <w:r>
         <w:t>Рисунок 2 – Диаграмма классов</w:t>
@@ -1506,6 +1509,2165 @@
     </w:p>
     <w:p>
       <w:pPr>
+        <w:pStyle w:val="2"/>
+        <w:keepNext/>
+        <w:spacing w:before="240" w:after="120" w:line="360" w:lineRule="auto"/>
+        <w:ind w:firstLine="709"/>
+        <w:jc w:val="center"/>
+        <w:rPr>
+          <w:sz w:val="32"/>
+          <w:szCs w:val="32"/>
+        </w:rPr>
+      </w:pPr>
+      <w:r>
+        <w:rPr>
+          <w:sz w:val="32"/>
+          <w:szCs w:val="32"/>
+        </w:rPr>
+        <w:t>Расчет аппаратных требований</w:t>
+      </w:r>
+    </w:p>
+    <w:p>
+      <w:pPr>
+        <w:pStyle w:val="2"/>
+        <w:keepNext/>
+        <w:ind w:firstLine="709"/>
+        <w:rPr>
+          <w:b w:val="0"/>
+          <w:bCs w:val="0"/>
+          <w:i/>
+        </w:rPr>
+      </w:pPr>
+      <m:oMath>
+        <m:sSub>
+          <m:sSubPr>
+            <m:ctrlPr>
+              <w:rPr>
+                <w:rFonts w:ascii="Cambria Math" w:hAnsi="Cambria Math"/>
+                <w:b w:val="0"/>
+                <w:bCs w:val="0"/>
+                <w:lang w:val="en-US"/>
+              </w:rPr>
+            </m:ctrlPr>
+          </m:sSubPr>
+          <m:e>
+            <m:r>
+              <m:rPr>
+                <m:sty m:val="p"/>
+              </m:rPr>
+              <w:rPr>
+                <w:rFonts w:ascii="Cambria Math" w:hAnsi="Cambria Math"/>
+                <w:lang w:val="en-US"/>
+              </w:rPr>
+              <m:t>N</m:t>
+            </m:r>
+          </m:e>
+          <m:sub>
+            <m:r>
+              <m:rPr>
+                <m:sty m:val="p"/>
+              </m:rPr>
+              <w:rPr>
+                <w:rFonts w:ascii="Cambria Math" w:hAnsi="Cambria Math"/>
+                <w:lang w:val="en-US"/>
+              </w:rPr>
+              <m:t>requests</m:t>
+            </m:r>
+            <m:r>
+              <m:rPr>
+                <m:sty m:val="p"/>
+              </m:rPr>
+              <w:rPr>
+                <w:rFonts w:ascii="Cambria Math" w:hAnsi="Cambria Math"/>
+              </w:rPr>
+              <m:t>/</m:t>
+            </m:r>
+            <m:r>
+              <m:rPr>
+                <m:sty m:val="p"/>
+              </m:rPr>
+              <w:rPr>
+                <w:rFonts w:ascii="Cambria Math" w:hAnsi="Cambria Math"/>
+                <w:lang w:val="en-US"/>
+              </w:rPr>
+              <m:t>day</m:t>
+            </m:r>
+          </m:sub>
+        </m:sSub>
+        <m:r>
+          <m:rPr>
+            <m:sty m:val="p"/>
+          </m:rPr>
+          <w:rPr>
+            <w:rFonts w:ascii="Cambria Math" w:hAnsi="Cambria Math"/>
+          </w:rPr>
+          <m:t>=50×</m:t>
+        </m:r>
+        <m:r>
+          <m:rPr>
+            <m:sty m:val="p"/>
+          </m:rPr>
+          <w:rPr>
+            <w:rFonts w:ascii="Cambria Math" w:hAnsi="Cambria Math"/>
+          </w:rPr>
+          <m:t>1</m:t>
+        </m:r>
+        <m:r>
+          <m:rPr>
+            <m:sty m:val="p"/>
+          </m:rPr>
+          <w:rPr>
+            <w:rFonts w:ascii="Cambria Math" w:hAnsi="Cambria Math"/>
+          </w:rPr>
+          <m:t>0=</m:t>
+        </m:r>
+        <m:r>
+          <m:rPr>
+            <m:sty m:val="p"/>
+          </m:rPr>
+          <w:rPr>
+            <w:rFonts w:ascii="Cambria Math" w:hAnsi="Cambria Math"/>
+          </w:rPr>
+          <m:t>5</m:t>
+        </m:r>
+        <m:r>
+          <m:rPr>
+            <m:sty m:val="p"/>
+          </m:rPr>
+          <w:rPr>
+            <w:rFonts w:ascii="Cambria Math" w:hAnsi="Cambria Math"/>
+          </w:rPr>
+          <m:t>00 заявок/сутки</m:t>
+        </m:r>
+      </m:oMath>
+      <w:r>
+        <w:rPr>
+          <w:b w:val="0"/>
+          <w:bCs w:val="0"/>
+          <w:i/>
+        </w:rPr>
+        <w:tab/>
+      </w:r>
+      <w:r>
+        <w:rPr>
+          <w:b w:val="0"/>
+          <w:bCs w:val="0"/>
+        </w:rPr>
+        <w:t>(1)</w:t>
+      </w:r>
+    </w:p>
+    <w:p>
+      <w:pPr>
+        <w:pStyle w:val="2"/>
+        <w:keepNext/>
+        <w:jc w:val="center"/>
+        <w:rPr>
+          <w:b w:val="0"/>
+          <w:bCs w:val="0"/>
+        </w:rPr>
+      </w:pPr>
+      <w:r>
+        <w:rPr>
+          <w:b w:val="0"/>
+          <w:bCs w:val="0"/>
+        </w:rPr>
+        <w:t xml:space="preserve">На каждую заявку согласно диаграмме последовательности (рисунок </w:t>
+      </w:r>
+      <w:r>
+        <w:rPr>
+          <w:b w:val="0"/>
+          <w:bCs w:val="0"/>
+        </w:rPr>
+        <w:t>3</w:t>
+      </w:r>
+      <w:r>
+        <w:rPr>
+          <w:b w:val="0"/>
+          <w:bCs w:val="0"/>
+        </w:rPr>
+        <w:t xml:space="preserve">) приходится </w:t>
+      </w:r>
+      <w:r>
+        <w:rPr>
+          <w:b w:val="0"/>
+          <w:bCs w:val="0"/>
+        </w:rPr>
+        <w:t>8</w:t>
+      </w:r>
+      <w:r>
+        <w:rPr>
+          <w:b w:val="0"/>
+          <w:bCs w:val="0"/>
+        </w:rPr>
+        <w:t xml:space="preserve"> запросов. Вычислим </w:t>
+      </w:r>
+      <w:r>
+        <w:rPr>
+          <w:b w:val="0"/>
+          <w:bCs w:val="0"/>
+          <w:lang w:val="en-US"/>
+        </w:rPr>
+        <w:t>RPS</w:t>
+      </w:r>
+      <w:r>
+        <w:rPr>
+          <w:b w:val="0"/>
+          <w:bCs w:val="0"/>
+        </w:rPr>
+        <w:t xml:space="preserve"> с учётом того, что каждый </w:t>
+      </w:r>
+      <w:r>
+        <w:rPr>
+          <w:b w:val="0"/>
+          <w:bCs w:val="0"/>
+        </w:rPr>
+        <w:lastRenderedPageBreak/>
+        <w:t>исследователь</w:t>
+      </w:r>
+      <w:r>
+        <w:rPr>
+          <w:b w:val="0"/>
+          <w:bCs w:val="0"/>
+        </w:rPr>
+        <w:t xml:space="preserve"> даёт ещё по одному </w:t>
+      </w:r>
+      <w:r>
+        <w:rPr>
+          <w:b w:val="0"/>
+          <w:bCs w:val="0"/>
+          <w:lang w:val="en-US"/>
+        </w:rPr>
+        <w:t>RPS</w:t>
+      </w:r>
+      <w:r>
+        <w:rPr>
+          <w:b w:val="0"/>
+          <w:bCs w:val="0"/>
+        </w:rPr>
+        <w:t xml:space="preserve"> из-за </w:t>
+      </w:r>
+      <w:r>
+        <w:rPr>
+          <w:b w:val="0"/>
+          <w:bCs w:val="0"/>
+          <w:lang w:val="en-US"/>
+        </w:rPr>
+        <w:t>polling</w:t>
+      </w:r>
+      <w:r>
+        <w:rPr>
+          <w:b w:val="0"/>
+          <w:bCs w:val="0"/>
+        </w:rPr>
+        <w:t>. RPS вычисляется с помощью формулы 2.</w:t>
+      </w:r>
+    </w:p>
+    <w:p>
+      <w:pPr>
+        <w:pStyle w:val="2"/>
+        <w:keepNext/>
+        <w:jc w:val="center"/>
+        <w:rPr>
+          <w:b w:val="0"/>
+          <w:bCs w:val="0"/>
+          <w:i/>
+        </w:rPr>
+      </w:pPr>
+      <w:r>
+        <w:rPr>
+          <w:b w:val="0"/>
+          <w:bCs w:val="0"/>
+        </w:rPr>
+        <w:tab/>
+      </w:r>
+      <m:oMath>
+        <m:r>
+          <m:rPr>
+            <m:sty m:val="p"/>
+          </m:rPr>
+          <w:rPr>
+            <w:rFonts w:ascii="Cambria Math" w:hAnsi="Cambria Math"/>
+            <w:lang w:val="en-US"/>
+          </w:rPr>
+          <m:t>RPS</m:t>
+        </m:r>
+        <m:r>
+          <m:rPr>
+            <m:sty m:val="p"/>
+          </m:rPr>
+          <w:rPr>
+            <w:rFonts w:ascii="Cambria Math" w:hAnsi="Cambria Math"/>
+          </w:rPr>
+          <m:t>=</m:t>
+        </m:r>
+        <m:f>
+          <m:fPr>
+            <m:ctrlPr>
+              <w:rPr>
+                <w:rFonts w:ascii="Cambria Math" w:hAnsi="Cambria Math"/>
+                <w:b w:val="0"/>
+                <w:bCs w:val="0"/>
+                <w:iCs/>
+                <w:lang w:val="en-US"/>
+              </w:rPr>
+            </m:ctrlPr>
+          </m:fPr>
+          <m:num>
+            <m:sSub>
+              <m:sSubPr>
+                <m:ctrlPr>
+                  <w:rPr>
+                    <w:rFonts w:ascii="Cambria Math" w:hAnsi="Cambria Math"/>
+                    <w:b w:val="0"/>
+                    <w:bCs w:val="0"/>
+                    <w:iCs/>
+                    <w:lang w:val="en-US"/>
+                  </w:rPr>
+                </m:ctrlPr>
+              </m:sSubPr>
+              <m:e>
+                <m:r>
+                  <m:rPr>
+                    <m:sty m:val="p"/>
+                  </m:rPr>
+                  <w:rPr>
+                    <w:rFonts w:ascii="Cambria Math" w:hAnsi="Cambria Math"/>
+                    <w:lang w:val="en-US"/>
+                  </w:rPr>
+                  <m:t>N</m:t>
+                </m:r>
+              </m:e>
+              <m:sub>
+                <m:r>
+                  <m:rPr>
+                    <m:sty m:val="p"/>
+                  </m:rPr>
+                  <w:rPr>
+                    <w:rFonts w:ascii="Cambria Math" w:hAnsi="Cambria Math"/>
+                    <w:lang w:val="en-US"/>
+                  </w:rPr>
+                  <m:t>requests</m:t>
+                </m:r>
+                <m:r>
+                  <m:rPr>
+                    <m:sty m:val="p"/>
+                  </m:rPr>
+                  <w:rPr>
+                    <w:rFonts w:ascii="Cambria Math" w:hAnsi="Cambria Math"/>
+                  </w:rPr>
+                  <m:t>/</m:t>
+                </m:r>
+                <m:r>
+                  <m:rPr>
+                    <m:sty m:val="p"/>
+                  </m:rPr>
+                  <w:rPr>
+                    <w:rFonts w:ascii="Cambria Math" w:hAnsi="Cambria Math"/>
+                    <w:lang w:val="en-US"/>
+                  </w:rPr>
+                  <m:t>day</m:t>
+                </m:r>
+              </m:sub>
+            </m:sSub>
+            <m:r>
+              <m:rPr>
+                <m:sty m:val="p"/>
+              </m:rPr>
+              <w:rPr>
+                <w:rFonts w:ascii="Cambria Math" w:hAnsi="Cambria Math"/>
+              </w:rPr>
+              <m:t>×</m:t>
+            </m:r>
+            <m:r>
+              <m:rPr>
+                <m:sty m:val="p"/>
+              </m:rPr>
+              <w:rPr>
+                <w:rFonts w:ascii="Cambria Math" w:hAnsi="Cambria Math"/>
+              </w:rPr>
+              <m:t>8</m:t>
+            </m:r>
+          </m:num>
+          <m:den>
+            <m:r>
+              <m:rPr>
+                <m:sty m:val="p"/>
+              </m:rPr>
+              <w:rPr>
+                <w:rFonts w:ascii="Cambria Math" w:hAnsi="Cambria Math"/>
+              </w:rPr>
+              <m:t>28800</m:t>
+            </m:r>
+          </m:den>
+        </m:f>
+        <m:r>
+          <m:rPr>
+            <m:sty m:val="p"/>
+          </m:rPr>
+          <w:rPr>
+            <w:rFonts w:ascii="Cambria Math" w:hAnsi="Cambria Math"/>
+          </w:rPr>
+          <m:t>+</m:t>
+        </m:r>
+        <m:r>
+          <w:rPr>
+            <w:rFonts w:ascii="Cambria Math" w:hAnsi="Cambria Math"/>
+          </w:rPr>
+          <m:t>20</m:t>
+        </m:r>
+        <m:r>
+          <m:rPr>
+            <m:sty m:val="p"/>
+          </m:rPr>
+          <w:rPr>
+            <w:rFonts w:ascii="Cambria Math" w:hAnsi="Cambria Math"/>
+          </w:rPr>
+          <m:t>×</m:t>
+        </m:r>
+        <m:r>
+          <w:rPr>
+            <w:rFonts w:ascii="Cambria Math" w:hAnsi="Cambria Math"/>
+          </w:rPr>
+          <m:t>1</m:t>
+        </m:r>
+        <m:r>
+          <m:rPr>
+            <m:sty m:val="p"/>
+          </m:rPr>
+          <w:rPr>
+            <w:rFonts w:ascii="Cambria Math" w:hAnsi="Cambria Math"/>
+          </w:rPr>
+          <m:t>=</m:t>
+        </m:r>
+        <m:f>
+          <m:fPr>
+            <m:ctrlPr>
+              <w:rPr>
+                <w:rFonts w:ascii="Cambria Math" w:hAnsi="Cambria Math"/>
+                <w:b w:val="0"/>
+                <w:bCs w:val="0"/>
+                <w:iCs/>
+                <w:lang w:val="en-US"/>
+              </w:rPr>
+            </m:ctrlPr>
+          </m:fPr>
+          <m:num>
+            <m:r>
+              <m:rPr>
+                <m:sty m:val="p"/>
+              </m:rPr>
+              <w:rPr>
+                <w:rFonts w:ascii="Cambria Math" w:hAnsi="Cambria Math"/>
+              </w:rPr>
+              <m:t>500×</m:t>
+            </m:r>
+            <m:r>
+              <m:rPr>
+                <m:sty m:val="p"/>
+              </m:rPr>
+              <w:rPr>
+                <w:rFonts w:ascii="Cambria Math" w:hAnsi="Cambria Math"/>
+              </w:rPr>
+              <m:t>8</m:t>
+            </m:r>
+          </m:num>
+          <m:den>
+            <m:r>
+              <m:rPr>
+                <m:sty m:val="p"/>
+              </m:rPr>
+              <w:rPr>
+                <w:rFonts w:ascii="Cambria Math" w:hAnsi="Cambria Math"/>
+              </w:rPr>
+              <m:t>28800</m:t>
+            </m:r>
+          </m:den>
+        </m:f>
+        <m:r>
+          <m:rPr>
+            <m:sty m:val="p"/>
+          </m:rPr>
+          <w:rPr>
+            <w:rFonts w:ascii="Cambria Math" w:hAnsi="Cambria Math"/>
+          </w:rPr>
+          <m:t>+</m:t>
+        </m:r>
+        <m:r>
+          <w:rPr>
+            <w:rFonts w:ascii="Cambria Math" w:hAnsi="Cambria Math"/>
+          </w:rPr>
+          <m:t>20</m:t>
+        </m:r>
+        <m:r>
+          <m:rPr>
+            <m:sty m:val="p"/>
+          </m:rPr>
+          <w:rPr>
+            <w:rFonts w:ascii="Cambria Math" w:hAnsi="Cambria Math"/>
+          </w:rPr>
+          <m:t>≈2</m:t>
+        </m:r>
+        <m:r>
+          <m:rPr>
+            <m:sty m:val="p"/>
+          </m:rPr>
+          <w:rPr>
+            <w:rFonts w:ascii="Cambria Math" w:hAnsi="Cambria Math"/>
+          </w:rPr>
+          <m:t>0</m:t>
+        </m:r>
+        <m:r>
+          <m:rPr>
+            <m:sty m:val="p"/>
+          </m:rPr>
+          <w:rPr>
+            <w:rFonts w:ascii="Cambria Math" w:hAnsi="Cambria Math"/>
+          </w:rPr>
+          <m:t>,</m:t>
+        </m:r>
+        <m:r>
+          <m:rPr>
+            <m:sty m:val="p"/>
+          </m:rPr>
+          <w:rPr>
+            <w:rFonts w:ascii="Cambria Math" w:hAnsi="Cambria Math"/>
+          </w:rPr>
+          <m:t>14</m:t>
+        </m:r>
+        <m:r>
+          <m:rPr>
+            <m:sty m:val="p"/>
+          </m:rPr>
+          <w:rPr>
+            <w:rFonts w:ascii="Cambria Math" w:hAnsi="Cambria Math"/>
+          </w:rPr>
+          <m:t xml:space="preserve"> запросов/с</m:t>
+        </m:r>
+      </m:oMath>
+      <w:r>
+        <w:rPr>
+          <w:b w:val="0"/>
+          <w:bCs w:val="0"/>
+        </w:rPr>
+        <w:tab/>
+        <w:t>(2)</w:t>
+      </w:r>
+    </w:p>
+    <w:p>
+      <w:pPr>
+        <w:pStyle w:val="2"/>
+        <w:keepNext/>
+        <w:jc w:val="center"/>
+        <w:rPr>
+          <w:b w:val="0"/>
+          <w:bCs w:val="0"/>
+        </w:rPr>
+      </w:pPr>
+      <w:r>
+        <w:rPr>
+          <w:b w:val="0"/>
+          <w:bCs w:val="0"/>
+        </w:rPr>
+        <w:t xml:space="preserve">Рассчитаем количество ядер по формуле 3 (примем </w:t>
+      </w:r>
+      <w:r>
+        <w:rPr>
+          <w:b w:val="0"/>
+          <w:bCs w:val="0"/>
+          <w:lang w:val="en-US"/>
+        </w:rPr>
+        <w:t>k</w:t>
+      </w:r>
+      <w:r>
+        <w:rPr>
+          <w:b w:val="0"/>
+          <w:bCs w:val="0"/>
+          <w:vertAlign w:val="subscript"/>
+          <w:lang w:val="en-US"/>
+        </w:rPr>
+        <w:t>reserve</w:t>
+      </w:r>
+      <w:r>
+        <w:rPr>
+          <w:b w:val="0"/>
+          <w:bCs w:val="0"/>
+        </w:rPr>
+        <w:t xml:space="preserve"> = 1,5), а необходимый объём оперативной памяти по формуле 4 с учётом того, что на 1 ядро требуется 4 ГБ ОП.</w:t>
+      </w:r>
+    </w:p>
+    <w:p>
+      <w:pPr>
+        <w:pStyle w:val="2"/>
+        <w:keepNext/>
+        <w:jc w:val="center"/>
+        <w:rPr>
+          <w:b w:val="0"/>
+          <w:bCs w:val="0"/>
+        </w:rPr>
+      </w:pPr>
+      <w:r>
+        <w:rPr>
+          <w:b w:val="0"/>
+          <w:bCs w:val="0"/>
+        </w:rPr>
+        <w:tab/>
+      </w:r>
+      <m:oMath>
+        <m:sSub>
+          <m:sSubPr>
+            <m:ctrlPr>
+              <w:rPr>
+                <w:rFonts w:ascii="Cambria Math" w:hAnsi="Cambria Math"/>
+                <w:b w:val="0"/>
+                <w:bCs w:val="0"/>
+                <w:iCs/>
+                <w:lang w:val="en-US"/>
+              </w:rPr>
+            </m:ctrlPr>
+          </m:sSubPr>
+          <m:e>
+            <m:r>
+              <m:rPr>
+                <m:sty m:val="p"/>
+              </m:rPr>
+              <w:rPr>
+                <w:rFonts w:ascii="Cambria Math" w:hAnsi="Cambria Math"/>
+                <w:lang w:val="en-US"/>
+              </w:rPr>
+              <m:t>N</m:t>
+            </m:r>
+          </m:e>
+          <m:sub>
+            <m:r>
+              <m:rPr>
+                <m:sty m:val="p"/>
+              </m:rPr>
+              <w:rPr>
+                <w:rFonts w:ascii="Cambria Math" w:hAnsi="Cambria Math"/>
+                <w:lang w:val="en-US"/>
+              </w:rPr>
+              <m:t>cores</m:t>
+            </m:r>
+          </m:sub>
+        </m:sSub>
+        <m:r>
+          <m:rPr>
+            <m:sty m:val="p"/>
+          </m:rPr>
+          <w:rPr>
+            <w:rFonts w:ascii="Cambria Math" w:hAnsi="Cambria Math"/>
+          </w:rPr>
+          <m:t xml:space="preserve">= </m:t>
+        </m:r>
+        <m:f>
+          <m:fPr>
+            <m:ctrlPr>
+              <w:rPr>
+                <w:rFonts w:ascii="Cambria Math" w:hAnsi="Cambria Math"/>
+                <w:b w:val="0"/>
+                <w:bCs w:val="0"/>
+                <w:iCs/>
+                <w:lang w:val="en-US"/>
+              </w:rPr>
+            </m:ctrlPr>
+          </m:fPr>
+          <m:num>
+            <m:r>
+              <m:rPr>
+                <m:sty m:val="p"/>
+              </m:rPr>
+              <w:rPr>
+                <w:rFonts w:ascii="Cambria Math" w:hAnsi="Cambria Math"/>
+                <w:lang w:val="en-US"/>
+              </w:rPr>
+              <m:t>RPS</m:t>
+            </m:r>
+          </m:num>
+          <m:den>
+            <m:sSub>
+              <m:sSubPr>
+                <m:ctrlPr>
+                  <w:rPr>
+                    <w:rFonts w:ascii="Cambria Math" w:hAnsi="Cambria Math"/>
+                    <w:b w:val="0"/>
+                    <w:bCs w:val="0"/>
+                    <w:iCs/>
+                    <w:lang w:val="en-US"/>
+                  </w:rPr>
+                </m:ctrlPr>
+              </m:sSubPr>
+              <m:e>
+                <m:r>
+                  <m:rPr>
+                    <m:sty m:val="p"/>
+                  </m:rPr>
+                  <w:rPr>
+                    <w:rFonts w:ascii="Cambria Math" w:hAnsi="Cambria Math"/>
+                    <w:lang w:val="en-US"/>
+                  </w:rPr>
+                  <m:t>RPS</m:t>
+                </m:r>
+              </m:e>
+              <m:sub>
+                <m:r>
+                  <m:rPr>
+                    <m:sty m:val="p"/>
+                  </m:rPr>
+                  <w:rPr>
+                    <w:rFonts w:ascii="Cambria Math" w:hAnsi="Cambria Math"/>
+                    <w:lang w:val="en-US"/>
+                  </w:rPr>
+                  <m:t>core</m:t>
+                </m:r>
+              </m:sub>
+            </m:sSub>
+          </m:den>
+        </m:f>
+        <m:r>
+          <m:rPr>
+            <m:sty m:val="p"/>
+          </m:rPr>
+          <w:rPr>
+            <w:rFonts w:ascii="Cambria Math" w:hAnsi="Cambria Math"/>
+          </w:rPr>
+          <m:t xml:space="preserve"> ×</m:t>
+        </m:r>
+        <m:sSub>
+          <m:sSubPr>
+            <m:ctrlPr>
+              <w:rPr>
+                <w:rFonts w:ascii="Cambria Math" w:hAnsi="Cambria Math"/>
+                <w:b w:val="0"/>
+                <w:bCs w:val="0"/>
+                <w:iCs/>
+                <w:lang w:val="en-US"/>
+              </w:rPr>
+            </m:ctrlPr>
+          </m:sSubPr>
+          <m:e>
+            <m:r>
+              <m:rPr>
+                <m:sty m:val="p"/>
+              </m:rPr>
+              <w:rPr>
+                <w:rFonts w:ascii="Cambria Math" w:hAnsi="Cambria Math"/>
+                <w:lang w:val="en-US"/>
+              </w:rPr>
+              <m:t>k</m:t>
+            </m:r>
+          </m:e>
+          <m:sub>
+            <m:r>
+              <m:rPr>
+                <m:sty m:val="p"/>
+              </m:rPr>
+              <w:rPr>
+                <w:rFonts w:ascii="Cambria Math" w:hAnsi="Cambria Math"/>
+                <w:lang w:val="en-US"/>
+              </w:rPr>
+              <m:t>reserve</m:t>
+            </m:r>
+          </m:sub>
+        </m:sSub>
+        <m:r>
+          <m:rPr>
+            <m:sty m:val="p"/>
+          </m:rPr>
+          <w:rPr>
+            <w:rFonts w:ascii="Cambria Math" w:hAnsi="Cambria Math"/>
+          </w:rPr>
+          <m:t>=</m:t>
+        </m:r>
+        <m:f>
+          <m:fPr>
+            <m:ctrlPr>
+              <w:rPr>
+                <w:rFonts w:ascii="Cambria Math" w:hAnsi="Cambria Math"/>
+                <w:b w:val="0"/>
+                <w:bCs w:val="0"/>
+                <w:iCs/>
+                <w:lang w:val="en-US"/>
+              </w:rPr>
+            </m:ctrlPr>
+          </m:fPr>
+          <m:num>
+            <m:r>
+              <m:rPr>
+                <m:sty m:val="p"/>
+              </m:rPr>
+              <w:rPr>
+                <w:rFonts w:ascii="Cambria Math" w:hAnsi="Cambria Math"/>
+              </w:rPr>
+              <m:t>2</m:t>
+            </m:r>
+            <m:r>
+              <w:rPr>
+                <w:rFonts w:ascii="Cambria Math" w:hAnsi="Cambria Math"/>
+              </w:rPr>
+              <m:t>0</m:t>
+            </m:r>
+            <m:r>
+              <m:rPr>
+                <m:sty m:val="p"/>
+              </m:rPr>
+              <w:rPr>
+                <w:rFonts w:ascii="Cambria Math" w:hAnsi="Cambria Math"/>
+              </w:rPr>
+              <m:t>,</m:t>
+            </m:r>
+            <m:r>
+              <m:rPr>
+                <m:sty m:val="p"/>
+              </m:rPr>
+              <w:rPr>
+                <w:rFonts w:ascii="Cambria Math" w:hAnsi="Cambria Math"/>
+              </w:rPr>
+              <m:t>14</m:t>
+            </m:r>
+          </m:num>
+          <m:den>
+            <m:r>
+              <m:rPr>
+                <m:sty m:val="p"/>
+              </m:rPr>
+              <w:rPr>
+                <w:rFonts w:ascii="Cambria Math" w:hAnsi="Cambria Math"/>
+              </w:rPr>
+              <m:t>500</m:t>
+            </m:r>
+          </m:den>
+        </m:f>
+        <m:r>
+          <m:rPr>
+            <m:sty m:val="p"/>
+          </m:rPr>
+          <w:rPr>
+            <w:rFonts w:ascii="Cambria Math" w:hAnsi="Cambria Math"/>
+          </w:rPr>
+          <m:t xml:space="preserve"> ×1,5≈1 ядро</m:t>
+        </m:r>
+      </m:oMath>
+      <w:r>
+        <w:rPr>
+          <w:b w:val="0"/>
+          <w:bCs w:val="0"/>
+        </w:rPr>
+        <w:tab/>
+        <w:t>(3)</w:t>
+      </w:r>
+    </w:p>
+    <w:p>
+      <w:pPr>
+        <w:pStyle w:val="2"/>
+        <w:keepNext/>
+        <w:ind w:firstLine="709"/>
+        <w:rPr>
+          <w:b w:val="0"/>
+          <w:bCs w:val="0"/>
+        </w:rPr>
+      </w:pPr>
+      <w:r>
+        <w:rPr>
+          <w:b w:val="0"/>
+          <w:bCs w:val="0"/>
+        </w:rPr>
+        <w:tab/>
+      </w:r>
+      <m:oMath>
+        <m:r>
+          <m:rPr>
+            <m:sty m:val="p"/>
+          </m:rPr>
+          <w:rPr>
+            <w:rFonts w:ascii="Cambria Math" w:hAnsi="Cambria Math"/>
+            <w:lang w:val="en-US"/>
+          </w:rPr>
+          <m:t>RAM</m:t>
+        </m:r>
+        <m:r>
+          <m:rPr>
+            <m:sty m:val="p"/>
+          </m:rPr>
+          <w:rPr>
+            <w:rFonts w:ascii="Cambria Math" w:hAnsi="Cambria Math"/>
+          </w:rPr>
+          <m:t>=4×</m:t>
+        </m:r>
+        <m:sSub>
+          <m:sSubPr>
+            <m:ctrlPr>
+              <w:rPr>
+                <w:rFonts w:ascii="Cambria Math" w:hAnsi="Cambria Math"/>
+                <w:b w:val="0"/>
+                <w:bCs w:val="0"/>
+                <w:iCs/>
+                <w:lang w:val="en-US"/>
+              </w:rPr>
+            </m:ctrlPr>
+          </m:sSubPr>
+          <m:e>
+            <m:r>
+              <m:rPr>
+                <m:sty m:val="p"/>
+              </m:rPr>
+              <w:rPr>
+                <w:rFonts w:ascii="Cambria Math" w:hAnsi="Cambria Math"/>
+                <w:lang w:val="en-US"/>
+              </w:rPr>
+              <m:t>N</m:t>
+            </m:r>
+          </m:e>
+          <m:sub>
+            <m:r>
+              <m:rPr>
+                <m:sty m:val="p"/>
+              </m:rPr>
+              <w:rPr>
+                <w:rFonts w:ascii="Cambria Math" w:hAnsi="Cambria Math"/>
+                <w:lang w:val="en-US"/>
+              </w:rPr>
+              <m:t>cores</m:t>
+            </m:r>
+          </m:sub>
+        </m:sSub>
+        <m:r>
+          <m:rPr>
+            <m:sty m:val="p"/>
+          </m:rPr>
+          <w:rPr>
+            <w:rFonts w:ascii="Cambria Math" w:hAnsi="Cambria Math"/>
+          </w:rPr>
+          <m:t>=4×1=4 ГБ</m:t>
+        </m:r>
+      </m:oMath>
+      <w:r>
+        <w:rPr>
+          <w:b w:val="0"/>
+          <w:bCs w:val="0"/>
+        </w:rPr>
+        <w:tab/>
+        <w:t>(4)</w:t>
+      </w:r>
+    </w:p>
+    <w:p>
+      <w:pPr>
+        <w:pStyle w:val="2"/>
+        <w:keepNext/>
+        <w:jc w:val="center"/>
+      </w:pPr>
+      <w:r>
+        <w:rPr>
+          <w:b w:val="0"/>
+          <w:bCs w:val="0"/>
+        </w:rPr>
+        <w:t>Рассчитаем размеры записей в таблиц</w:t>
+      </w:r>
+      <w:r>
+        <w:rPr>
+          <w:b w:val="0"/>
+          <w:bCs w:val="0"/>
+        </w:rPr>
+        <w:t xml:space="preserve">ы </w:t>
+      </w:r>
+      <w:r>
+        <w:rPr>
+          <w:b w:val="0"/>
+          <w:bCs w:val="0"/>
+        </w:rPr>
+        <w:t>dendro_scale_patterns</w:t>
+      </w:r>
+    </w:p>
+    <w:p>
+      <w:pPr>
+        <w:pStyle w:val="2"/>
+        <w:keepNext/>
+        <w:jc w:val="center"/>
+        <w:rPr>
+          <w:b w:val="0"/>
+          <w:bCs w:val="0"/>
+        </w:rPr>
+      </w:pPr>
+      <w:r>
+        <w:rPr>
+          <w:b w:val="0"/>
+          <w:bCs w:val="0"/>
+        </w:rPr>
+        <w:t xml:space="preserve"> (ид и создатель — по 8 байт, две системные даты — по 8 байт, название — 160 байт, статус — 20 байт, два URL — по 255 байт, два описания — 500 и 2000 байт, год начала и число колец — по 8 байт) и dendro_pattern_likes</w:t>
+      </w:r>
+    </w:p>
+    <w:p>
+      <w:pPr>
+        <w:pStyle w:val="2"/>
+        <w:keepNext/>
+        <w:jc w:val="center"/>
+      </w:pPr>
+      <w:r>
+        <w:rPr>
+          <w:b w:val="0"/>
+          <w:bCs w:val="0"/>
+        </w:rPr>
+        <w:t xml:space="preserve"> (ид, исследователь и паттерн — по 8 байт) по формулам 5 и 6.</w:t>
+      </w:r>
+    </w:p>
+    <w:p>
+      <w:pPr>
+        <w:pStyle w:val="2"/>
+        <w:keepNext/>
+        <w:jc w:val="center"/>
+        <w:rPr>
+          <w:b w:val="0"/>
+          <w:bCs w:val="0"/>
+        </w:rPr>
+      </w:pPr>
+      <w:r>
+        <w:rPr>
+          <w:b w:val="0"/>
+          <w:bCs w:val="0"/>
+        </w:rPr>
+        <w:tab/>
+      </w:r>
+      <m:oMath>
+        <m:sSub>
+          <m:sSubPr>
+            <m:ctrlPr>
+              <w:rPr>
+                <w:rFonts w:ascii="Cambria Math" w:hAnsi="Cambria Math"/>
+                <w:b w:val="0"/>
+                <w:bCs w:val="0"/>
+                <w:iCs/>
+              </w:rPr>
+            </m:ctrlPr>
+          </m:sSubPr>
+          <m:e>
+            <m:r>
+              <m:rPr>
+                <m:sty m:val="p"/>
+              </m:rPr>
+              <w:rPr>
+                <w:rFonts w:ascii="Cambria Math" w:hAnsi="Cambria Math"/>
+                <w:lang w:val="en-US"/>
+              </w:rPr>
+              <m:t>S</m:t>
+            </m:r>
+          </m:e>
+          <m:sub>
+            <m:r>
+              <w:rPr>
+                <w:rFonts w:ascii="Cambria Math" w:hAnsi="Cambria Math"/>
+              </w:rPr>
+              <m:t>d</m:t>
+            </m:r>
+            <m:r>
+              <w:rPr>
+                <w:rFonts w:ascii="Cambria Math" w:hAnsi="Cambria Math"/>
+                <w:lang w:val="en-US"/>
+              </w:rPr>
+              <m:t>sp</m:t>
+            </m:r>
+          </m:sub>
+        </m:sSub>
+        <m:r>
+          <m:rPr>
+            <m:sty m:val="p"/>
+          </m:rPr>
+          <w:rPr>
+            <w:rFonts w:ascii="Cambria Math" w:hAnsi="Cambria Math"/>
+          </w:rPr>
+          <m:t>=</m:t>
+        </m:r>
+        <m:r>
+          <m:rPr>
+            <m:sty m:val="p"/>
+          </m:rPr>
+          <w:rPr>
+            <w:rFonts w:ascii="Cambria Math" w:hAnsi="Cambria Math"/>
+          </w:rPr>
+          <m:t>8</m:t>
+        </m:r>
+        <m:r>
+          <m:rPr>
+            <m:sty m:val="p"/>
+          </m:rPr>
+          <w:rPr>
+            <w:rFonts w:ascii="Cambria Math" w:hAnsi="Cambria Math"/>
+          </w:rPr>
+          <m:t>+</m:t>
+        </m:r>
+        <m:r>
+          <m:rPr>
+            <m:sty m:val="p"/>
+          </m:rPr>
+          <w:rPr>
+            <w:rFonts w:ascii="Cambria Math" w:hAnsi="Cambria Math"/>
+          </w:rPr>
+          <m:t>8</m:t>
+        </m:r>
+        <m:r>
+          <m:rPr>
+            <m:sty m:val="p"/>
+          </m:rPr>
+          <w:rPr>
+            <w:rFonts w:ascii="Cambria Math" w:hAnsi="Cambria Math"/>
+          </w:rPr>
+          <m:t>+</m:t>
+        </m:r>
+        <m:r>
+          <m:rPr>
+            <m:sty m:val="p"/>
+          </m:rPr>
+          <w:rPr>
+            <w:rFonts w:ascii="Cambria Math" w:hAnsi="Cambria Math"/>
+          </w:rPr>
+          <m:t>8×2+160+20+255×2+500+2000+8+8=3238</m:t>
+        </m:r>
+        <m:r>
+          <m:rPr>
+            <m:sty m:val="p"/>
+          </m:rPr>
+          <w:rPr>
+            <w:rFonts w:ascii="Cambria Math" w:hAnsi="Cambria Math"/>
+          </w:rPr>
+          <m:t xml:space="preserve"> байт</m:t>
+        </m:r>
+      </m:oMath>
+      <w:r>
+        <w:rPr>
+          <w:b w:val="0"/>
+          <w:bCs w:val="0"/>
+        </w:rPr>
+        <w:tab/>
+        <w:t>(5)</w:t>
+      </w:r>
+    </w:p>
+    <w:p>
+      <w:pPr>
+        <w:pStyle w:val="2"/>
+        <w:keepNext/>
+        <w:jc w:val="center"/>
+        <w:rPr>
+          <w:b w:val="0"/>
+          <w:bCs w:val="0"/>
+        </w:rPr>
+      </w:pPr>
+      <w:r>
+        <w:rPr>
+          <w:b w:val="0"/>
+          <w:bCs w:val="0"/>
+        </w:rPr>
+        <w:tab/>
+      </w:r>
+      <m:oMath>
+        <m:sSub>
+          <m:sSubPr>
+            <m:ctrlPr>
+              <w:rPr>
+                <w:rFonts w:ascii="Cambria Math" w:hAnsi="Cambria Math"/>
+                <w:b w:val="0"/>
+                <w:bCs w:val="0"/>
+                <w:iCs/>
+              </w:rPr>
+            </m:ctrlPr>
+          </m:sSubPr>
+          <m:e>
+            <m:r>
+              <m:rPr>
+                <m:sty m:val="p"/>
+              </m:rPr>
+              <w:rPr>
+                <w:rFonts w:ascii="Cambria Math" w:hAnsi="Cambria Math"/>
+                <w:lang w:val="en-US"/>
+              </w:rPr>
+              <m:t>S</m:t>
+            </m:r>
+          </m:e>
+          <m:sub>
+            <m:r>
+              <m:rPr>
+                <m:sty m:val="p"/>
+              </m:rPr>
+              <w:rPr>
+                <w:rFonts w:ascii="Cambria Math" w:hAnsi="Cambria Math"/>
+                <w:lang w:val="en-US"/>
+              </w:rPr>
+              <m:t>like</m:t>
+            </m:r>
+          </m:sub>
+        </m:sSub>
+        <m:r>
+          <m:rPr>
+            <m:sty m:val="p"/>
+          </m:rPr>
+          <w:rPr>
+            <w:rFonts w:ascii="Cambria Math" w:hAnsi="Cambria Math"/>
+          </w:rPr>
+          <m:t>=8×3=</m:t>
+        </m:r>
+        <m:r>
+          <m:rPr>
+            <m:sty m:val="p"/>
+          </m:rPr>
+          <w:rPr>
+            <w:rFonts w:ascii="Cambria Math" w:hAnsi="Cambria Math"/>
+          </w:rPr>
+          <m:t>2</m:t>
+        </m:r>
+        <m:r>
+          <w:rPr>
+            <w:rFonts w:ascii="Cambria Math" w:hAnsi="Cambria Math"/>
+            <w:lang w:val="en-US"/>
+          </w:rPr>
+          <m:t>4</m:t>
+        </m:r>
+        <m:r>
+          <m:rPr>
+            <m:sty m:val="p"/>
+          </m:rPr>
+          <w:rPr>
+            <w:rFonts w:ascii="Cambria Math" w:hAnsi="Cambria Math"/>
+          </w:rPr>
+          <m:t xml:space="preserve"> байт</m:t>
+        </m:r>
+      </m:oMath>
+      <w:r>
+        <w:rPr>
+          <w:b w:val="0"/>
+          <w:bCs w:val="0"/>
+        </w:rPr>
+        <w:tab/>
+        <w:t>(6)</w:t>
+      </w:r>
+    </w:p>
+    <w:p>
+      <w:pPr>
+        <w:pStyle w:val="2"/>
+        <w:keepNext/>
+        <w:jc w:val="center"/>
+        <w:rPr>
+          <w:b w:val="0"/>
+          <w:bCs w:val="0"/>
+        </w:rPr>
+      </w:pPr>
+      <w:r>
+        <w:rPr>
+          <w:b w:val="0"/>
+          <w:bCs w:val="0"/>
+        </w:rPr>
+        <w:t xml:space="preserve">Рассчитаем объём диска для сервера. Для этого определим годовой объём данных по формуле 7 и прирост размера базы данных за год по формуле 8, после этого по формуле 9 вычислим необходимый объём диска для сервера (примем </w:t>
+      </w:r>
+      <w:r>
+        <w:rPr>
+          <w:b w:val="0"/>
+          <w:bCs w:val="0"/>
+          <w:lang w:val="en-US"/>
+        </w:rPr>
+        <w:t>N</w:t>
+      </w:r>
+      <w:r>
+        <w:rPr>
+          <w:b w:val="0"/>
+          <w:bCs w:val="0"/>
+          <w:vertAlign w:val="subscript"/>
+          <w:lang w:val="en-US"/>
+        </w:rPr>
+        <w:t>reserve</w:t>
+      </w:r>
+      <w:r>
+        <w:rPr>
+          <w:b w:val="0"/>
+          <w:bCs w:val="0"/>
+        </w:rPr>
+        <w:t xml:space="preserve"> = </w:t>
+      </w:r>
+      <w:r>
+        <w:rPr>
+          <w:b w:val="0"/>
+          <w:bCs w:val="0"/>
+        </w:rPr>
+        <w:t>5</w:t>
+      </w:r>
+      <w:r>
+        <w:rPr>
+          <w:b w:val="0"/>
+          <w:bCs w:val="0"/>
+        </w:rPr>
+        <w:t xml:space="preserve"> ГБ для запаса).</w:t>
+      </w:r>
+    </w:p>
+    <w:p>
+      <w:pPr>
+        <w:pStyle w:val="2"/>
+        <w:keepNext/>
+        <w:jc w:val="center"/>
+        <w:rPr>
+          <w:b w:val="0"/>
+          <w:bCs w:val="0"/>
+        </w:rPr>
+      </w:pPr>
+      <w:r>
+        <w:rPr>
+          <w:b w:val="0"/>
+          <w:bCs w:val="0"/>
+        </w:rPr>
+        <w:tab/>
+      </w:r>
+      <m:oMath>
+        <m:sSub>
+          <m:sSubPr>
+            <m:ctrlPr>
+              <w:rPr>
+                <w:rFonts w:ascii="Cambria Math" w:hAnsi="Cambria Math"/>
+                <w:b w:val="0"/>
+                <w:bCs w:val="0"/>
+                <w:iCs/>
+              </w:rPr>
+            </m:ctrlPr>
+          </m:sSubPr>
+          <m:e>
+            <m:r>
+              <m:rPr>
+                <m:sty m:val="p"/>
+              </m:rPr>
+              <w:rPr>
+                <w:rFonts w:ascii="Cambria Math" w:hAnsi="Cambria Math"/>
+              </w:rPr>
+              <m:t>N</m:t>
+            </m:r>
+          </m:e>
+          <m:sub>
+            <m:r>
+              <m:rPr>
+                <m:sty m:val="p"/>
+              </m:rPr>
+              <w:rPr>
+                <w:rFonts w:ascii="Cambria Math" w:hAnsi="Cambria Math"/>
+              </w:rPr>
+              <m:t>year</m:t>
+            </m:r>
+          </m:sub>
+        </m:sSub>
+        <m:r>
+          <m:rPr>
+            <m:sty m:val="p"/>
+          </m:rPr>
+          <w:rPr>
+            <w:rFonts w:ascii="Cambria Math" w:hAnsi="Cambria Math"/>
+          </w:rPr>
+          <m:t>=</m:t>
+        </m:r>
+        <m:sSub>
+          <m:sSubPr>
+            <m:ctrlPr>
+              <w:rPr>
+                <w:rFonts w:ascii="Cambria Math" w:hAnsi="Cambria Math"/>
+                <w:b w:val="0"/>
+                <w:bCs w:val="0"/>
+                <w:iCs/>
+                <w:lang w:val="en-US"/>
+              </w:rPr>
+            </m:ctrlPr>
+          </m:sSubPr>
+          <m:e>
+            <m:r>
+              <m:rPr>
+                <m:sty m:val="p"/>
+              </m:rPr>
+              <w:rPr>
+                <w:rFonts w:ascii="Cambria Math" w:hAnsi="Cambria Math"/>
+                <w:lang w:val="en-US"/>
+              </w:rPr>
+              <m:t>N</m:t>
+            </m:r>
+          </m:e>
+          <m:sub>
+            <m:r>
+              <m:rPr>
+                <m:sty m:val="p"/>
+              </m:rPr>
+              <w:rPr>
+                <w:rFonts w:ascii="Cambria Math" w:hAnsi="Cambria Math"/>
+                <w:lang w:val="en-US"/>
+              </w:rPr>
+              <m:t>requests</m:t>
+            </m:r>
+            <m:r>
+              <m:rPr>
+                <m:sty m:val="p"/>
+              </m:rPr>
+              <w:rPr>
+                <w:rFonts w:ascii="Cambria Math" w:hAnsi="Cambria Math"/>
+              </w:rPr>
+              <m:t>/</m:t>
+            </m:r>
+            <m:r>
+              <m:rPr>
+                <m:sty m:val="p"/>
+              </m:rPr>
+              <w:rPr>
+                <w:rFonts w:ascii="Cambria Math" w:hAnsi="Cambria Math"/>
+                <w:lang w:val="en-US"/>
+              </w:rPr>
+              <m:t>day</m:t>
+            </m:r>
+          </m:sub>
+        </m:sSub>
+        <m:r>
+          <m:rPr>
+            <m:sty m:val="p"/>
+          </m:rPr>
+          <w:rPr>
+            <w:rFonts w:ascii="Cambria Math" w:hAnsi="Cambria Math"/>
+          </w:rPr>
+          <m:t>×365=500×365=</m:t>
+        </m:r>
+        <m:r>
+          <m:rPr>
+            <m:sty m:val="p"/>
+          </m:rPr>
+          <w:rPr>
+            <w:rFonts w:ascii="Cambria Math" w:hAnsi="Cambria Math"/>
+          </w:rPr>
+          <m:t>1</m:t>
+        </m:r>
+        <m:r>
+          <w:rPr>
+            <w:rFonts w:ascii="Cambria Math" w:hAnsi="Cambria Math"/>
+            <w:lang w:val="en-US"/>
+          </w:rPr>
+          <m:t>82</m:t>
+        </m:r>
+        <m:r>
+          <m:rPr>
+            <m:sty m:val="p"/>
+          </m:rPr>
+          <w:rPr>
+            <w:rFonts w:ascii="Cambria Math" w:hAnsi="Cambria Math"/>
+          </w:rPr>
+          <m:t>500 заявок/год</m:t>
+        </m:r>
+      </m:oMath>
+      <w:r>
+        <w:rPr>
+          <w:b w:val="0"/>
+          <w:bCs w:val="0"/>
+        </w:rPr>
+        <w:tab/>
+        <w:t>(7)</w:t>
+      </w:r>
+    </w:p>
+    <w:p>
+      <w:pPr>
+        <w:pStyle w:val="2"/>
+        <w:keepNext/>
+        <w:jc w:val="center"/>
+        <w:rPr>
+          <w:b w:val="0"/>
+          <w:bCs w:val="0"/>
+        </w:rPr>
+      </w:pPr>
+      <w:r>
+        <w:rPr>
+          <w:b w:val="0"/>
+          <w:bCs w:val="0"/>
+        </w:rPr>
+        <w:tab/>
+      </w:r>
+      <m:oMath>
+        <m:r>
+          <m:rPr>
+            <m:sty m:val="p"/>
+          </m:rPr>
+          <w:rPr>
+            <w:rFonts w:ascii="Cambria Math" w:hAnsi="Cambria Math"/>
+            <w:lang w:val="en-US"/>
+          </w:rPr>
+          <m:t>D</m:t>
+        </m:r>
+        <m:sSub>
+          <m:sSubPr>
+            <m:ctrlPr>
+              <w:rPr>
+                <w:rFonts w:ascii="Cambria Math" w:hAnsi="Cambria Math"/>
+                <w:b w:val="0"/>
+                <w:bCs w:val="0"/>
+                <w:iCs/>
+                <w:lang w:val="en-US"/>
+              </w:rPr>
+            </m:ctrlPr>
+          </m:sSubPr>
+          <m:e>
+            <m:r>
+              <m:rPr>
+                <m:sty m:val="p"/>
+              </m:rPr>
+              <w:rPr>
+                <w:rFonts w:ascii="Cambria Math" w:hAnsi="Cambria Math"/>
+                <w:lang w:val="en-US"/>
+              </w:rPr>
+              <m:t>B</m:t>
+            </m:r>
+          </m:e>
+          <m:sub>
+            <m:r>
+              <m:rPr>
+                <m:sty m:val="p"/>
+              </m:rPr>
+              <w:rPr>
+                <w:rFonts w:ascii="Cambria Math" w:hAnsi="Cambria Math"/>
+                <w:lang w:val="en-US"/>
+              </w:rPr>
+              <m:t>growt</m:t>
+            </m:r>
+            <m:r>
+              <m:rPr>
+                <m:sty m:val="p"/>
+              </m:rPr>
+              <w:rPr>
+                <w:rFonts w:ascii="Cambria Math" w:hAnsi="Cambria Math"/>
+              </w:rPr>
+              <m:t>h/</m:t>
+            </m:r>
+            <m:r>
+              <m:rPr>
+                <m:sty m:val="p"/>
+              </m:rPr>
+              <w:rPr>
+                <w:rFonts w:ascii="Cambria Math" w:hAnsi="Cambria Math"/>
+                <w:lang w:val="en-US"/>
+              </w:rPr>
+              <m:t>year</m:t>
+            </m:r>
+          </m:sub>
+        </m:sSub>
+        <m:r>
+          <m:rPr>
+            <m:sty m:val="p"/>
+          </m:rPr>
+          <w:rPr>
+            <w:rFonts w:ascii="Cambria Math" w:hAnsi="Cambria Math"/>
+          </w:rPr>
+          <m:t>=</m:t>
+        </m:r>
+        <m:f>
+          <m:fPr>
+            <m:ctrlPr>
+              <w:rPr>
+                <w:rFonts w:ascii="Cambria Math" w:hAnsi="Cambria Math"/>
+                <w:b w:val="0"/>
+                <w:bCs w:val="0"/>
+                <w:iCs/>
+                <w:lang w:val="en-US"/>
+              </w:rPr>
+            </m:ctrlPr>
+          </m:fPr>
+          <m:num>
+            <m:sSub>
+              <m:sSubPr>
+                <m:ctrlPr>
+                  <w:rPr>
+                    <w:rFonts w:ascii="Cambria Math" w:hAnsi="Cambria Math"/>
+                    <w:b w:val="0"/>
+                    <w:bCs w:val="0"/>
+                    <w:iCs/>
+                  </w:rPr>
+                </m:ctrlPr>
+              </m:sSubPr>
+              <m:e>
+                <m:r>
+                  <m:rPr>
+                    <m:sty m:val="p"/>
+                  </m:rPr>
+                  <w:rPr>
+                    <w:rFonts w:ascii="Cambria Math" w:hAnsi="Cambria Math"/>
+                  </w:rPr>
+                  <m:t>N</m:t>
+                </m:r>
+              </m:e>
+              <m:sub>
+                <m:r>
+                  <m:rPr>
+                    <m:sty m:val="p"/>
+                  </m:rPr>
+                  <w:rPr>
+                    <w:rFonts w:ascii="Cambria Math" w:hAnsi="Cambria Math"/>
+                  </w:rPr>
+                  <m:t>year</m:t>
+                </m:r>
+              </m:sub>
+            </m:sSub>
+            <m:r>
+              <m:rPr>
+                <m:sty m:val="p"/>
+              </m:rPr>
+              <w:rPr>
+                <w:rFonts w:ascii="Cambria Math" w:hAnsi="Cambria Math"/>
+              </w:rPr>
+              <m:t>×(</m:t>
+            </m:r>
+            <m:sSub>
+              <m:sSubPr>
+                <m:ctrlPr>
+                  <w:rPr>
+                    <w:rFonts w:ascii="Cambria Math" w:hAnsi="Cambria Math"/>
+                    <w:b w:val="0"/>
+                    <w:bCs w:val="0"/>
+                    <w:iCs/>
+                  </w:rPr>
+                </m:ctrlPr>
+              </m:sSubPr>
+              <m:e>
+                <m:r>
+                  <m:rPr>
+                    <m:sty m:val="p"/>
+                  </m:rPr>
+                  <w:rPr>
+                    <w:rFonts w:ascii="Cambria Math" w:hAnsi="Cambria Math"/>
+                    <w:lang w:val="en-US"/>
+                  </w:rPr>
+                  <m:t>S</m:t>
+                </m:r>
+              </m:e>
+              <m:sub>
+                <m:r>
+                  <m:rPr>
+                    <m:sty m:val="p"/>
+                  </m:rPr>
+                  <w:rPr>
+                    <w:rFonts w:ascii="Cambria Math" w:hAnsi="Cambria Math"/>
+                  </w:rPr>
+                  <m:t>d</m:t>
+                </m:r>
+                <m:r>
+                  <w:rPr>
+                    <w:rFonts w:ascii="Cambria Math" w:hAnsi="Cambria Math"/>
+                    <w:lang w:val="en-US"/>
+                  </w:rPr>
+                  <m:t>sp</m:t>
+                </m:r>
+              </m:sub>
+            </m:sSub>
+            <m:r>
+              <m:rPr>
+                <m:sty m:val="p"/>
+              </m:rPr>
+              <w:rPr>
+                <w:rFonts w:ascii="Cambria Math" w:hAnsi="Cambria Math"/>
+              </w:rPr>
+              <m:t>+3×</m:t>
+            </m:r>
+            <m:sSub>
+              <m:sSubPr>
+                <m:ctrlPr>
+                  <w:rPr>
+                    <w:rFonts w:ascii="Cambria Math" w:hAnsi="Cambria Math"/>
+                    <w:b w:val="0"/>
+                    <w:bCs w:val="0"/>
+                    <w:iCs/>
+                  </w:rPr>
+                </m:ctrlPr>
+              </m:sSubPr>
+              <m:e>
+                <m:r>
+                  <m:rPr>
+                    <m:sty m:val="p"/>
+                  </m:rPr>
+                  <w:rPr>
+                    <w:rFonts w:ascii="Cambria Math" w:hAnsi="Cambria Math"/>
+                  </w:rPr>
+                  <m:t>S</m:t>
+                </m:r>
+              </m:e>
+              <m:sub>
+                <m:r>
+                  <m:rPr>
+                    <m:sty m:val="p"/>
+                  </m:rPr>
+                  <w:rPr>
+                    <w:rFonts w:ascii="Cambria Math" w:hAnsi="Cambria Math"/>
+                    <w:lang w:val="en-US"/>
+                  </w:rPr>
+                  <m:t>like</m:t>
+                </m:r>
+              </m:sub>
+            </m:sSub>
+            <m:r>
+              <m:rPr>
+                <m:sty m:val="p"/>
+              </m:rPr>
+              <w:rPr>
+                <w:rFonts w:ascii="Cambria Math" w:hAnsi="Cambria Math"/>
+              </w:rPr>
+              <m:t>)</m:t>
+            </m:r>
+          </m:num>
+          <m:den>
+            <m:r>
+              <m:rPr>
+                <m:sty m:val="p"/>
+              </m:rPr>
+              <w:rPr>
+                <w:rFonts w:ascii="Cambria Math" w:hAnsi="Cambria Math"/>
+              </w:rPr>
+              <m:t>1024×1024×1024</m:t>
+            </m:r>
+          </m:den>
+        </m:f>
+        <m:r>
+          <m:rPr>
+            <m:sty m:val="p"/>
+          </m:rPr>
+          <w:rPr>
+            <w:rFonts w:ascii="Cambria Math" w:hAnsi="Cambria Math"/>
+          </w:rPr>
+          <m:t>=</m:t>
+        </m:r>
+        <m:f>
+          <m:fPr>
+            <m:ctrlPr>
+              <w:rPr>
+                <w:rFonts w:ascii="Cambria Math" w:hAnsi="Cambria Math"/>
+                <w:b w:val="0"/>
+                <w:bCs w:val="0"/>
+                <w:iCs/>
+                <w:lang w:val="en-US"/>
+              </w:rPr>
+            </m:ctrlPr>
+          </m:fPr>
+          <m:num>
+            <m:r>
+              <m:rPr>
+                <m:sty m:val="p"/>
+              </m:rPr>
+              <w:rPr>
+                <w:rFonts w:ascii="Cambria Math" w:hAnsi="Cambria Math"/>
+              </w:rPr>
+              <m:t>1</m:t>
+            </m:r>
+            <m:r>
+              <w:rPr>
+                <w:rFonts w:ascii="Cambria Math" w:hAnsi="Cambria Math"/>
+                <w:lang w:val="en-US"/>
+              </w:rPr>
+              <m:t>82</m:t>
+            </m:r>
+            <m:r>
+              <m:rPr>
+                <m:sty m:val="p"/>
+              </m:rPr>
+              <w:rPr>
+                <w:rFonts w:ascii="Cambria Math" w:hAnsi="Cambria Math"/>
+              </w:rPr>
+              <m:t>500×(</m:t>
+            </m:r>
+            <m:r>
+              <m:rPr>
+                <m:sty m:val="p"/>
+              </m:rPr>
+              <w:rPr>
+                <w:rFonts w:ascii="Cambria Math" w:hAnsi="Cambria Math"/>
+              </w:rPr>
+              <m:t>3</m:t>
+            </m:r>
+            <m:r>
+              <w:rPr>
+                <w:rFonts w:ascii="Cambria Math" w:hAnsi="Cambria Math"/>
+                <w:lang w:val="en-US"/>
+              </w:rPr>
+              <m:t>238</m:t>
+            </m:r>
+            <m:r>
+              <m:rPr>
+                <m:sty m:val="p"/>
+              </m:rPr>
+              <w:rPr>
+                <w:rFonts w:ascii="Cambria Math" w:hAnsi="Cambria Math"/>
+              </w:rPr>
+              <m:t>+3×</m:t>
+            </m:r>
+            <m:r>
+              <m:rPr>
+                <m:sty m:val="p"/>
+              </m:rPr>
+              <w:rPr>
+                <w:rFonts w:ascii="Cambria Math" w:hAnsi="Cambria Math"/>
+              </w:rPr>
+              <m:t>2</m:t>
+            </m:r>
+            <m:r>
+              <w:rPr>
+                <w:rFonts w:ascii="Cambria Math" w:hAnsi="Cambria Math"/>
+                <w:lang w:val="en-US"/>
+              </w:rPr>
+              <m:t>4</m:t>
+            </m:r>
+            <m:r>
+              <m:rPr>
+                <m:sty m:val="p"/>
+              </m:rPr>
+              <w:rPr>
+                <w:rFonts w:ascii="Cambria Math" w:hAnsi="Cambria Math"/>
+              </w:rPr>
+              <m:t>)</m:t>
+            </m:r>
+          </m:num>
+          <m:den>
+            <m:r>
+              <m:rPr>
+                <m:sty m:val="p"/>
+              </m:rPr>
+              <w:rPr>
+                <w:rFonts w:ascii="Cambria Math" w:hAnsi="Cambria Math"/>
+              </w:rPr>
+              <m:t>1024×1024×1024</m:t>
+            </m:r>
+          </m:den>
+        </m:f>
+        <m:r>
+          <m:rPr>
+            <m:sty m:val="p"/>
+          </m:rPr>
+          <w:rPr>
+            <w:rFonts w:ascii="Cambria Math" w:hAnsi="Cambria Math"/>
+          </w:rPr>
+          <m:t>≈</m:t>
+        </m:r>
+        <m:r>
+          <m:rPr>
+            <m:sty m:val="p"/>
+          </m:rPr>
+          <w:rPr>
+            <w:rFonts w:ascii="Cambria Math" w:hAnsi="Cambria Math"/>
+          </w:rPr>
+          <m:t>0</m:t>
+        </m:r>
+        <m:r>
+          <w:rPr>
+            <w:rFonts w:ascii="Cambria Math" w:hAnsi="Cambria Math"/>
+            <w:lang w:val="en-US"/>
+          </w:rPr>
+          <m:t>,56</m:t>
+        </m:r>
+        <m:r>
+          <m:rPr>
+            <m:sty m:val="p"/>
+          </m:rPr>
+          <w:rPr>
+            <w:rFonts w:ascii="Cambria Math" w:hAnsi="Cambria Math"/>
+          </w:rPr>
+          <m:t xml:space="preserve"> </m:t>
+        </m:r>
+        <m:r>
+          <w:rPr>
+            <w:rFonts w:ascii="Cambria Math" w:hAnsi="Cambria Math"/>
+          </w:rPr>
+          <m:t>Г</m:t>
+        </m:r>
+        <m:r>
+          <m:rPr>
+            <m:sty m:val="p"/>
+          </m:rPr>
+          <w:rPr>
+            <w:rFonts w:ascii="Cambria Math" w:hAnsi="Cambria Math"/>
+          </w:rPr>
+          <m:t>Б/год</m:t>
+        </m:r>
+      </m:oMath>
+      <w:r>
+        <w:rPr>
+          <w:b w:val="0"/>
+          <w:bCs w:val="0"/>
+        </w:rPr>
+        <w:tab/>
+        <w:t>(8)</w:t>
+      </w:r>
+    </w:p>
+    <w:p>
+      <w:pPr>
+        <w:pStyle w:val="2"/>
+        <w:keepNext/>
+        <w:jc w:val="center"/>
+        <w:rPr>
+          <w:sz w:val="32"/>
+          <w:szCs w:val="32"/>
+        </w:rPr>
+      </w:pPr>
+      <m:oMath>
+        <m:r>
+          <m:rPr>
+            <m:sty m:val="p"/>
+          </m:rPr>
+          <w:rPr>
+            <w:rFonts w:ascii="Cambria Math" w:hAnsi="Cambria Math"/>
+            <w:lang w:val="en-US"/>
+          </w:rPr>
+          <m:t>D</m:t>
+        </m:r>
+        <m:sSub>
+          <m:sSubPr>
+            <m:ctrlPr>
+              <w:rPr>
+                <w:rFonts w:ascii="Cambria Math" w:hAnsi="Cambria Math"/>
+                <w:b w:val="0"/>
+                <w:bCs w:val="0"/>
+                <w:iCs/>
+                <w:lang w:val="en-US"/>
+              </w:rPr>
+            </m:ctrlPr>
+          </m:sSubPr>
+          <m:e>
+            <m:r>
+              <m:rPr>
+                <m:sty m:val="p"/>
+              </m:rPr>
+              <w:rPr>
+                <w:rFonts w:ascii="Cambria Math" w:hAnsi="Cambria Math"/>
+                <w:lang w:val="en-US"/>
+              </w:rPr>
+              <m:t>isk</m:t>
+            </m:r>
+          </m:e>
+          <m:sub>
+            <m:r>
+              <m:rPr>
+                <m:sty m:val="p"/>
+              </m:rPr>
+              <w:rPr>
+                <w:rFonts w:ascii="Cambria Math" w:hAnsi="Cambria Math"/>
+                <w:lang w:val="en-US"/>
+              </w:rPr>
+              <m:t>total</m:t>
+            </m:r>
+          </m:sub>
+        </m:sSub>
+        <m:r>
+          <m:rPr>
+            <m:sty m:val="p"/>
+          </m:rPr>
+          <w:rPr>
+            <w:rFonts w:ascii="Cambria Math" w:hAnsi="Cambria Math"/>
+          </w:rPr>
+          <m:t>=5×</m:t>
+        </m:r>
+        <m:r>
+          <m:rPr>
+            <m:sty m:val="p"/>
+          </m:rPr>
+          <w:rPr>
+            <w:rFonts w:ascii="Cambria Math" w:hAnsi="Cambria Math"/>
+            <w:lang w:val="en-US"/>
+          </w:rPr>
+          <m:t>D</m:t>
+        </m:r>
+        <m:sSub>
+          <m:sSubPr>
+            <m:ctrlPr>
+              <w:rPr>
+                <w:rFonts w:ascii="Cambria Math" w:hAnsi="Cambria Math"/>
+                <w:b w:val="0"/>
+                <w:bCs w:val="0"/>
+                <w:iCs/>
+                <w:lang w:val="en-US"/>
+              </w:rPr>
+            </m:ctrlPr>
+          </m:sSubPr>
+          <m:e>
+            <m:r>
+              <m:rPr>
+                <m:sty m:val="p"/>
+              </m:rPr>
+              <w:rPr>
+                <w:rFonts w:ascii="Cambria Math" w:hAnsi="Cambria Math"/>
+                <w:lang w:val="en-US"/>
+              </w:rPr>
+              <m:t>B</m:t>
+            </m:r>
+          </m:e>
+          <m:sub>
+            <m:r>
+              <m:rPr>
+                <m:sty m:val="p"/>
+              </m:rPr>
+              <w:rPr>
+                <w:rFonts w:ascii="Cambria Math" w:hAnsi="Cambria Math"/>
+                <w:lang w:val="en-US"/>
+              </w:rPr>
+              <m:t>growt</m:t>
+            </m:r>
+            <m:r>
+              <m:rPr>
+                <m:sty m:val="p"/>
+              </m:rPr>
+              <w:rPr>
+                <w:rFonts w:ascii="Cambria Math" w:hAnsi="Cambria Math"/>
+              </w:rPr>
+              <m:t>h/</m:t>
+            </m:r>
+            <m:r>
+              <m:rPr>
+                <m:sty m:val="p"/>
+              </m:rPr>
+              <w:rPr>
+                <w:rFonts w:ascii="Cambria Math" w:hAnsi="Cambria Math"/>
+                <w:lang w:val="en-US"/>
+              </w:rPr>
+              <m:t>year</m:t>
+            </m:r>
+          </m:sub>
+        </m:sSub>
+        <m:r>
+          <m:rPr>
+            <m:sty m:val="p"/>
+          </m:rPr>
+          <w:rPr>
+            <w:rFonts w:ascii="Cambria Math" w:hAnsi="Cambria Math"/>
+          </w:rPr>
+          <m:t>+</m:t>
+        </m:r>
+        <m:sSub>
+          <m:sSubPr>
+            <m:ctrlPr>
+              <w:rPr>
+                <w:rFonts w:ascii="Cambria Math" w:hAnsi="Cambria Math"/>
+                <w:b w:val="0"/>
+                <w:bCs w:val="0"/>
+                <w:lang w:val="en-US"/>
+              </w:rPr>
+            </m:ctrlPr>
+          </m:sSubPr>
+          <m:e>
+            <m:r>
+              <m:rPr>
+                <m:sty m:val="p"/>
+              </m:rPr>
+              <w:rPr>
+                <w:rFonts w:ascii="Cambria Math" w:hAnsi="Cambria Math"/>
+                <w:lang w:val="en-US"/>
+              </w:rPr>
+              <m:t>N</m:t>
+            </m:r>
+          </m:e>
+          <m:sub>
+            <m:r>
+              <m:rPr>
+                <m:sty m:val="p"/>
+              </m:rPr>
+              <w:rPr>
+                <w:rFonts w:ascii="Cambria Math" w:hAnsi="Cambria Math"/>
+                <w:lang w:val="en-US"/>
+              </w:rPr>
+              <m:t>reserve</m:t>
+            </m:r>
+          </m:sub>
+        </m:sSub>
+        <m:r>
+          <w:rPr>
+            <w:rFonts w:ascii="Cambria Math" w:hAnsi="Cambria Math"/>
+          </w:rPr>
+          <m:t>=</m:t>
+        </m:r>
+        <m:r>
+          <m:rPr>
+            <m:sty m:val="p"/>
+          </m:rPr>
+          <w:rPr>
+            <w:rFonts w:ascii="Cambria Math" w:hAnsi="Cambria Math"/>
+          </w:rPr>
+          <m:t>5×</m:t>
+        </m:r>
+        <m:r>
+          <m:rPr>
+            <m:sty m:val="p"/>
+          </m:rPr>
+          <w:rPr>
+            <w:rFonts w:ascii="Cambria Math" w:hAnsi="Cambria Math"/>
+          </w:rPr>
+          <m:t>0</m:t>
+        </m:r>
+        <m:r>
+          <w:rPr>
+            <w:rFonts w:ascii="Cambria Math" w:hAnsi="Cambria Math"/>
+            <w:lang w:val="en-US"/>
+          </w:rPr>
+          <m:t>,56</m:t>
+        </m:r>
+        <m:r>
+          <m:rPr>
+            <m:sty m:val="p"/>
+          </m:rPr>
+          <w:rPr>
+            <w:rFonts w:ascii="Cambria Math" w:hAnsi="Cambria Math"/>
+          </w:rPr>
+          <m:t>+</m:t>
+        </m:r>
+        <m:r>
+          <m:rPr>
+            <m:sty m:val="p"/>
+          </m:rPr>
+          <w:rPr>
+            <w:rFonts w:ascii="Cambria Math" w:hAnsi="Cambria Math"/>
+          </w:rPr>
+          <m:t>5</m:t>
+        </m:r>
+        <m:r>
+          <m:rPr>
+            <m:sty m:val="p"/>
+          </m:rPr>
+          <w:rPr>
+            <w:rFonts w:ascii="Cambria Math" w:hAnsi="Cambria Math"/>
+          </w:rPr>
+          <m:t>=</m:t>
+        </m:r>
+        <m:r>
+          <m:rPr>
+            <m:sty m:val="p"/>
+          </m:rPr>
+          <w:rPr>
+            <w:rFonts w:ascii="Cambria Math" w:hAnsi="Cambria Math"/>
+          </w:rPr>
+          <m:t>7</m:t>
+        </m:r>
+        <m:r>
+          <w:rPr>
+            <w:rFonts w:ascii="Cambria Math" w:hAnsi="Cambria Math"/>
+            <w:lang w:val="en-US"/>
+          </w:rPr>
+          <m:t>,8</m:t>
+        </m:r>
+        <m:r>
+          <m:rPr>
+            <m:sty m:val="p"/>
+          </m:rPr>
+          <w:rPr>
+            <w:rFonts w:ascii="Cambria Math" w:hAnsi="Cambria Math"/>
+          </w:rPr>
+          <m:t xml:space="preserve"> </m:t>
+        </m:r>
+        <m:r>
+          <w:rPr>
+            <w:rFonts w:ascii="Cambria Math" w:hAnsi="Cambria Math"/>
+          </w:rPr>
+          <m:t>Г</m:t>
+        </m:r>
+        <m:r>
+          <m:rPr>
+            <m:sty m:val="p"/>
+          </m:rPr>
+          <w:rPr>
+            <w:rFonts w:ascii="Cambria Math" w:hAnsi="Cambria Math"/>
+          </w:rPr>
+          <m:t>Б</m:t>
+        </m:r>
+      </m:oMath>
+      <w:r>
+        <w:rPr>
+          <w:b w:val="0"/>
+          <w:bCs w:val="0"/>
+        </w:rPr>
+        <w:tab/>
+        <w:t>(9)</w:t>
+      </w:r>
+    </w:p>
+    <w:p>
+      <w:pPr>
         <w:spacing w:after="240" w:line="360" w:lineRule="auto"/>
         <w:jc w:val="center"/>
       </w:pPr>
@@ -1863,21 +4025,53 @@
           <w:szCs w:val="16"/>
         </w:rPr>
         <w:tab/>
-        <w:t xml:space="preserve"> (подпись)</w:t>
-      </w:r>
+        <w:t xml:space="preserve"> (</w:t>
+      </w:r>
+      <w:proofErr w:type="gramStart"/>
       <w:r>
         <w:rPr>
           <w:sz w:val="16"/>
           <w:szCs w:val="16"/>
         </w:rPr>
-        <w:t xml:space="preserve">                           </w:t>
+        <w:t>подпись)</w:t>
       </w:r>
       <w:r>
         <w:rPr>
           <w:sz w:val="16"/>
           <w:szCs w:val="16"/>
         </w:rPr>
-        <w:t>(инициалы и</w:t>
+        <w:t xml:space="preserve">   </w:t>
+      </w:r>
+      <w:proofErr w:type="gramEnd"/>
+      <w:r>
+        <w:rPr>
+          <w:sz w:val="16"/>
+          <w:szCs w:val="16"/>
+        </w:rPr>
+        <w:t xml:space="preserve">                     </w:t>
+      </w:r>
+      <w:proofErr w:type="gramStart"/>
+      <w:r>
+        <w:rPr>
+          <w:sz w:val="16"/>
+          <w:szCs w:val="16"/>
+        </w:rPr>
+        <w:t xml:space="preserve">   </w:t>
+      </w:r>
+      <w:r>
+        <w:rPr>
+          <w:sz w:val="16"/>
+          <w:szCs w:val="16"/>
+        </w:rPr>
+        <w:t>(</w:t>
+      </w:r>
+      <w:proofErr w:type="gramEnd"/>
+      <w:r>
+        <w:rPr>
+          <w:sz w:val="16"/>
+          <w:szCs w:val="16"/>
+        </w:rPr>
+        <w:t>инициалы и</w:t>
       </w:r>
       <w:r>
         <w:rPr>
@@ -1964,7 +4158,7 @@
           <w:sz w:val="36"/>
           <w:szCs w:val="36"/>
         </w:rPr>
-        <w:t xml:space="preserve">Приложение для путешественников </w:t>
+        <w:t xml:space="preserve">Приложение для </w:t>
       </w:r>
       <w:r>
         <w:rPr>
@@ -1974,8 +4168,18 @@
           <w:sz w:val="36"/>
           <w:szCs w:val="36"/>
         </w:rPr>
+        <w:t xml:space="preserve">оценки возраста </w:t>
+      </w:r>
+      <w:r>
+        <w:rPr>
+          <w:b/>
+          <w:bCs/>
+          <w:color w:val="000000"/>
+          <w:sz w:val="36"/>
+          <w:szCs w:val="36"/>
+        </w:rPr>
         <w:br/>
-        <w:t>с рекомендательной системой</w:t>
+        <w:t>по паттернам дендрошкалы</w:t>
       </w:r>
     </w:p>
     <w:p>
@@ -2311,7 +4515,39 @@
                 <w:sz w:val="16"/>
                 <w:szCs w:val="16"/>
               </w:rPr>
-              <w:t xml:space="preserve">   (подпись)                                      (инициалы и фамилия)</w:t>
+              <w:t xml:space="preserve">   (</w:t>
+            </w:r>
+            <w:proofErr w:type="gramStart"/>
+            <w:r>
+              <w:rPr>
+                <w:sz w:val="16"/>
+                <w:szCs w:val="16"/>
+              </w:rPr>
+              <w:t xml:space="preserve">подпись)   </w:t>
+            </w:r>
+            <w:proofErr w:type="gramEnd"/>
+            <w:r>
+              <w:rPr>
+                <w:sz w:val="16"/>
+                <w:szCs w:val="16"/>
+              </w:rPr>
+              <w:t xml:space="preserve">                                </w:t>
+            </w:r>
+            <w:proofErr w:type="gramStart"/>
+            <w:r>
+              <w:rPr>
+                <w:sz w:val="16"/>
+                <w:szCs w:val="16"/>
+              </w:rPr>
+              <w:t xml:space="preserve">   (</w:t>
+            </w:r>
+            <w:proofErr w:type="gramEnd"/>
+            <w:r>
+              <w:rPr>
+                <w:sz w:val="16"/>
+                <w:szCs w:val="16"/>
+              </w:rPr>
+              <w:t>инициалы и фамилия)</w:t>
             </w:r>
           </w:p>
           <w:p>
@@ -9122,15 +11358,37 @@
                 <w:szCs w:val="28"/>
               </w:rPr>
             </w:pPr>
-            <w:r>
-              <w:rPr>
-                <w:rFonts w:ascii="Times New Roman" w:eastAsia="Times New Roman" w:hAnsi="Times New Roman" w:cs="Times New Roman"/>
-                <w:color w:val="000000"/>
-                <w:sz w:val="28"/>
-                <w:szCs w:val="28"/>
-              </w:rPr>
-              <w:t>{ like: 0 | 1 }</w:t>
-            </w:r>
+            <w:proofErr w:type="gramStart"/>
+            <w:r>
+              <w:rPr>
+                <w:rFonts w:ascii="Times New Roman" w:eastAsia="Times New Roman" w:hAnsi="Times New Roman" w:cs="Times New Roman"/>
+                <w:color w:val="000000"/>
+                <w:sz w:val="28"/>
+                <w:szCs w:val="28"/>
+              </w:rPr>
+              <w:t>{ like</w:t>
+            </w:r>
+            <w:proofErr w:type="gramEnd"/>
+            <w:r>
+              <w:rPr>
+                <w:rFonts w:ascii="Times New Roman" w:eastAsia="Times New Roman" w:hAnsi="Times New Roman" w:cs="Times New Roman"/>
+                <w:color w:val="000000"/>
+                <w:sz w:val="28"/>
+                <w:szCs w:val="28"/>
+              </w:rPr>
+              <w:t xml:space="preserve">: 0 | </w:t>
+            </w:r>
+            <w:proofErr w:type="gramStart"/>
+            <w:r>
+              <w:rPr>
+                <w:rFonts w:ascii="Times New Roman" w:eastAsia="Times New Roman" w:hAnsi="Times New Roman" w:cs="Times New Roman"/>
+                <w:color w:val="000000"/>
+                <w:sz w:val="28"/>
+                <w:szCs w:val="28"/>
+              </w:rPr>
+              <w:t>1 }</w:t>
+            </w:r>
+            <w:proofErr w:type="gramEnd"/>
           </w:p>
         </w:tc>
         <w:tc>

</xml_diff>